<commit_message>
Clean up mobile gap documentation into one current list
Replace the layered, multi-correction Sai handover review doc with a
single clean docs/mobile-app-gaps.md (+ REACT_Mobile_App_Gaps.docx) that
lists only the current, still-open gaps -- no historical narrative.
mobile-app-gaps is now documented as the active development branch for
all mobile work; mobile-code-replacement is retired. Trimmed TODO.md's
mobile section to a pointer instead of a full duplicate, fixed stale
cross-references and gap numbering in shawnick-onboarding.md and
dress-rehearsal-2026-07-28.md, and removed three already-resolved TODO
items in the prior commit's spirit.
</commit_message>
<xml_diff>
--- a/Resources/REACT_Dress_Rehearsal_2026-07-28.docx
+++ b/Resources/REACT_Dress_Rehearsal_2026-07-28.docx
@@ -2400,36 +2400,37 @@
     </w:p>
     <w:p>
       <w:r>
-        <w:t xml:space="preserve">This exercises the backend decision/log/receipt pipeline only, not the real mobile app. </w:t>
-      </w:r>
-      <w:r>
-        <w:rPr>
-          <w:b/>
-        </w:rPr>
-        <w:t>Note:</w:t>
-      </w:r>
-      <w:r>
-        <w:t xml:space="preserve"> this was written before we corrected which branch is actually Sai's mobile app — see the correction note at the top of </w:t>
+        <w:t xml:space="preserve">This exercises the backend decision/log/receipt pipeline only, not the real mobile app. Current mobile app gap list: </w:t>
       </w:r>
       <w:r>
         <w:rPr>
           <w:rFonts w:ascii="Consolas" w:hAnsi="Consolas"/>
           <w:sz w:val="20"/>
         </w:rPr>
-        <w:t>docs/sai-handover-review-2026-07-28.md</w:t>
+        <w:t>docs/mobile-app-gaps.md</w:t>
       </w:r>
       <w:r>
-        <w:t>. Sai's real app (</w:t>
+        <w:t xml:space="preserve">. Sai's real app (now merged into </w:t>
       </w:r>
       <w:r>
         <w:rPr>
           <w:rFonts w:ascii="Consolas" w:hAnsi="Consolas"/>
           <w:sz w:val="20"/>
         </w:rPr>
-        <w:t>origin/mobile-code-replacement</w:t>
+        <w:t>main</w:t>
       </w:r>
       <w:r>
-        <w:t xml:space="preserve">) does have a working offline queue (for telemetry) and does call </w:t>
+        <w:t xml:space="preserve">, active development on branch </w:t>
+      </w:r>
+      <w:r>
+        <w:rPr>
+          <w:rFonts w:ascii="Consolas" w:hAnsi="Consolas"/>
+          <w:sz w:val="20"/>
+        </w:rPr>
+        <w:t>mobile-app-gaps</w:t>
+      </w:r>
+      <w:r>
+        <w:t xml:space="preserve">) has a working offline queue (for telemetry) and calls </w:t>
       </w:r>
       <w:r>
         <w:rPr>
@@ -2439,17 +2440,7 @@
         <w:t>/telemetry/engagement/</w:t>
       </w:r>
       <w:r>
-        <w:t xml:space="preserve"> on push tap, but it has no EMA-submission UI and never calls </w:t>
-      </w:r>
-      <w:r>
-        <w:rPr>
-          <w:rFonts w:ascii="Consolas" w:hAnsi="Consolas"/>
-          <w:sz w:val="20"/>
-        </w:rPr>
-        <w:t>/jitai/receipt/</w:t>
-      </w:r>
-      <w:r>
-        <w:t xml:space="preserve"> — so "participant ready" here means the engine and the log, not the phone, and specifically not the EMA-submission gap, which is the bigger of the two.</w:t>
+        <w:t xml:space="preserve"> on push tap, but it has no EMA-submission UI and the receipt round trip is only half-wired — so "participant ready" here means the engine and the log, not the phone.</w:t>
       </w:r>
     </w:p>
     <w:p>

</xml_diff>